<commit_message>
Ticket 01: add C# and .NET to c07's skills and regenerate the golden set
Fixture change for maintainer review. The generator is byte-stable, so
only c07's four pairs differ; the other 44 are untouched.

Co-Authored-By: Claude Opus 5 <noreply@anthropic.com>
</commit_message>
<xml_diff>
--- a/fixtures/generated/c07__header-footer.docx
+++ b/fixtures/generated/c07__header-footer.docx
@@ -44,6 +44,16 @@
     <w:p>
       <w:r>
         <w:t>– ​Kotlin</w:t>
+      </w:r>
+    </w:p>
+    <w:p>
+      <w:r>
+        <w:t>– ​C#</w:t>
+      </w:r>
+    </w:p>
+    <w:p>
+      <w:r>
+        <w:t>– ​.NET</w:t>
       </w:r>
     </w:p>
     <w:p>

</xml_diff>